<commit_message>
counsel brief: Q3 asked about 24 months after the founder decided 12
The brief still put my superseded recommendation to counsel. Sending it
would have had them answer a question we had already moved past, and
possibly endorse a retention period we are not adopting.

Q3 now states the decided position - 12 months from closure of the last
linked care item, configurable 6 to 84, no indefinite option, with
notice and an export before any erasure - and asks whether that is
defensible.

Adds a question I owe counsel rather than one that flatters us: the
pre-erasure export means personal data leaves our systems in a file we
no longer control. We believe it protects the institution, but it is a
weakening of the erasure story and they should tell us now if it creates
a problem.

Not pushed yet: CI cancels superseded runs and #180 has one in flight.
</commit_message>
<xml_diff>
--- a/docs/business/ONEKOF_DATA_RESIDENCY_COUNSEL_BRIEF.docx
+++ b/docs/business/ONEKOF_DATA_RESIDENCY_COUNSEL_BRIEF.docx
@@ -1451,6 +1451,20 @@
     </w:p>
     <w:p>
       <w:pPr>
+        <w:spacing w:after="120"/>
+      </w:pPr>
+      <w:r>
+        <w:rPr>
+          <w:b/>
+          <w:bCs/>
+          <w:sz w:val="21"/>
+          <w:szCs w:val="21"/>
+        </w:rPr>
+        <w:t xml:space="preserve">Our position, decided internally: patient-linked operational records are retained for 12 months following closure of the last linked care item, configurable by the organization between 6 and 84 months, with no option to retain indefinitely. Before any erasure the organization receives notice and an export of the records due for deletion — we do not delete silently on a timer, because the operational history belongs to the institution even where the personal data should not persist in our systems.</w:t>
+      </w:r>
+    </w:p>
+    <w:p>
+      <w:pPr>
         <w:pStyle w:val="ListParagraph"/>
         <w:numPr>
           <w:ilvl w:val="0"/>
@@ -1463,7 +1477,24 @@
           <w:sz w:val="21"/>
           <w:szCs w:val="21"/>
         </w:rPr>
-        <w:t xml:space="preserve">Is a default of 24 months following closure of the last linked care item defensible, with organizations able to configure between 6 and 84 months and no option to retain indefinitely?</w:t>
+        <w:t xml:space="preserve">Is a 12-month default, bounded 6 to 84 months with no indefinite option, defensible under the storage limitation principle?</w:t>
+      </w:r>
+    </w:p>
+    <w:p>
+      <w:pPr>
+        <w:pStyle w:val="ListParagraph"/>
+        <w:numPr>
+          <w:ilvl w:val="0"/>
+          <w:numId w:val="6"/>
+        </w:numPr>
+        <w:spacing w:after="60"/>
+      </w:pPr>
+      <w:r>
+        <w:rPr>
+          <w:sz w:val="21"/>
+          <w:szCs w:val="21"/>
+        </w:rPr>
+        <w:t xml:space="preserve">Does the pre-erasure export satisfy, conflict with, or complicate the storage limitation duty? We regard it as protecting the institution, but it does mean personal data leaves our systems in a file we no longer control, and we would rather be told now if that creates a problem.</w:t>
       </w:r>
     </w:p>
     <w:p>

</xml_diff>